<commit_message>
docs: consolida revisão bibliográfica e finaliza resumo
</commit_message>
<xml_diff>
--- a/MODELO RESUMO 2026.docx
+++ b/MODELO RESUMO 2026.docx
@@ -5,7 +5,7 @@
     <w:p>
       <w:pPr>
         <w:spacing w:after="0" w:line="360" w:lineRule="auto" w:before="0"/>
-        <w:jc w:val="left"/>
+        <w:jc w:val="center"/>
         <w:rPr>
           <w:rFonts w:ascii="Times New Roman" w:cs="Times New Roman" w:eastAsia="Times New Roman" w:hAnsi="Times New Roman"/>
           <w:b w:val="1"/>
@@ -28,7 +28,7 @@
       </w:r>
       <w:r>
         <w:rPr>
-          <w:rFonts w:ascii="Times New Roman" w:hAnsi="Times New Roman" w:eastAsia="Times New Roman"/>
+          <w:rFonts w:ascii="Times New Roman" w:hAnsi="Times New Roman" w:eastAsia="Times New Roman" w:cs="Times New Roman"/>
           <w:b/>
           <w:sz w:val="28"/>
           <w:rtl w:val="0"/>
@@ -357,29 +357,13 @@
       </w:pPr>
       <w:r>
         <w:rPr>
-          <w:rFonts w:ascii="Times New Roman" w:cs="Times New Roman" w:eastAsia="Times New Roman" w:hAnsi="Times New Roman"/>
+          <w:rFonts w:ascii="Times New Roman" w:hAnsi="Times New Roman" w:cs="Times New Roman" w:eastAsia="Times New Roman"/>
           <w:b/>
-          <w:bCs w:val="1"/>
-          <w:sz w:val="24"/>
-          <w:szCs w:val="24"/>
-          <w:rtl w:val="0"/>
+          <w:bCs/>
+          <w:sz w:val="28"/>
+          <w:szCs w:val="28"/>
         </w:rPr>
         <w:t xml:space="preserve">RESUMO</w:t>
-      </w:r>
-      <w:r>
-        <w:rPr>
-          <w:rFonts w:ascii="Times New Roman" w:hAnsi="Times New Roman" w:eastAsia="Times New Roman"/>
-          <w:b/>
-          <w:sz w:val="24"/>
-        </w:rPr>
-      </w:r>
-      <w:r>
-        <w:rPr>
-          <w:rFonts w:ascii="Times New Roman" w:hAnsi="Times New Roman" w:eastAsia="Times New Roman"/>
-          <w:b/>
-          <w:sz w:val="24"/>
-          <w:rtl w:val="0"/>
-        </w:rPr>
       </w:r>
     </w:p>
     <w:p>
@@ -413,13 +397,15 @@
       </w:pPr>
       <w:r>
         <w:rPr>
-          <w:rFonts w:ascii="Times New Roman" w:hAnsi="Times New Roman" w:eastAsia="Times New Roman"/>
-          <w:b w:val="0"/>
-          <w:i w:val="0"/>
-          <w:color w:val="000000"/>
-          <w:sz w:val="24"/>
-        </w:rPr>
-        <w:t>Redes urbanas podem ser representadas por grafos, nos quais cruzamentos correspondem a vértices e vias a arestas com custos. Quando o trânsito varia ao longo do dia, o custo de uma aresta deixa de ser fixo e o problema do caminho mínimo exige considerar o instante de partida, a evolução dos tempos de percurso e, em certos modelos, a incerteza. Nesse contexto, este trabalho discute como a literatura caracteriza a complexidade, o uso de memória e a escalabilidade de Dijkstra e de variantes dependentes do tempo e bidirecionais. O tema é relevante porque uma rota teoricamente curta não representa necessariamente o percurso mais rápido em diferentes condições de tráfego. O objetivo é comparar as hipóteses e os limites das abordagens publicadas, sem desenvolver uma implementação ou realizar testes próprios. Foi realizada uma revisão bibliográfica de caráter qualitativo e comparativo, com buscas em Google Scholar, ScienceDirect, ACM Digital Library e IEEE Xplore. O recorte temporal adotado foi de 2016 a 2026, com termos em português e inglês relacionados a Dijkstra, caminho mínimo, tráfego dependente do tempo, complexidade, memória e escalabilidade. Foram considerados estudos científicos sobre busca de caminho mínimo em redes viárias dinâmicas, com atenção à análise formal ou à discussão explícita de desempenho e estrutura de dados. Foram excluídos trabalhos centrados em A* ou outras heurísticas, problemas de múltiplas entregas e roteamento de veículos, implementações sem análise teórica relevante e redes estáticas ou domínios distintos. A busca reuniu aproximadamente 2.533 registros; após a remoção de 130 duplicatas, a triagem de títulos e resumos classificou 2.325 como excluídos, 65 como dúvida e 13 como candidatos. A leitura da introdução e da conclusão desses candidatos resultou em quatro artigos para a síntese. Os estudos foram organizados segundo modelagem temporal, complexidade assintótica e limitações de memória e escalabilidade. Os resultados mostram que os custos reportados não podem ser comparados sem considerar as hipóteses de cada modelo. Constantinou et al. (2016) analisam velocidades viárias dependentes do tempo e apresentam, para Dijkstra dependente do tempo, expressões da ordem de O(n² + mK) com vetor simples e O(n log n + mK) com fila de prioridade de Fibonacci, em que n e m representam vértices e arestas e K está relacionado à discretização temporal. A representação do tempo, portanto, pode acrescentar custo ao processamento. Baum et al. (2016) exploram planejamento dependente do tempo com preferências e estruturas hierárquicas, incluindo consultas bidirecionais. A aceleração das consultas envolve atalhos cujos perfis temporais podem exigir memória significativa; aproximações desses perfis favorecem a eficiência, mas podem trocar exatidão por soluções próximas do ótimo. Heni, Coelho e Renaud (2019) estudam caminhos de custo mínimo com múltiplos objetivos. Suas variantes apresentam termos assintóticos adicionais associados às técnicas de cálculo e às variáveis definidas em cada método, o que reforça que expressões com símbolos iguais não devem ser comparadas sem verificar seus significados. Já Sun, Li e Liu (2023) incorporam a espera em semáforos e a natureza estocástica do tráfego, transformando o modelo em um problema dependente do tempo solucionado com base em Dijkstra. Entretanto, o artigo não oferece uma expressão de complexidade e uma medida de memória diretamente comparáveis às dos demais; também reconhece limites na representação dos tempos de sinalização e da dinâmica de tráfego em tempo real. Conclui-se que não há, entre os estudos examinados, uma variante universalmente superior. A complexidade depende da estrutura do grafo, do tratamento das funções temporais, das discretizações e dos objetivos considerados. A escalabilidade também envolve a memória necessária para armazenar perfis e atalhos, aspecto que uma análise apenas do tempo de execução não captura. Como limite, os quatro artigos adotam modelos e critérios diferentes, e a revisão não permite estabelecer um ranking numérico comum nem generalizar resultados para todas as cidades. Estudos futuros podem definir métricas e hipóteses comparáveis para analisar conjuntamente tempo, memória e qualidade das rotas, preservando a distinção entre garantias teóricas e resultados específicos de cada modelo.</w:t>
+          <w:rFonts w:ascii="Times New Roman" w:hAnsi="Times New Roman" w:cs="Times New Roman" w:eastAsia="Times New Roman"/>
+          <w:sz w:val="24"/>
+          <w:szCs w:val="24"/>
+        </w:rPr>
+        <w:t xml:space="preserve">Nas redes urbanas, encontrar o caminho mínimo não depende apenas de percorrer menos ruas. O resultado também varia conforme o custo atribuído às vias, o horário de saída e as condições representadas no modelo. Quando o tempo de travessia de uma aresta muda ao longo do dia, o grafo passa a descrever uma rede temporal, na qual a escolha de uma rota precisa considerar mais do que pesos fixos. A questão central, portanto, é entender quais hipóteses tornam os resultados de algoritmos de caminho mínimo válidos e como essas hipóteses afetam o custo computacional, a memória e a possibilidade de ampliar a análise para redes maiores. Essa discussão é relevante porque uma expressão assintótica isolada não garante, por si só, que uma abordagem seja adequada a todo cenário urbano.
+Para examinar o tema, foi realizada uma revisão bibliográfica qualitativa e comparativa, com buscas no Google Scholar, ScienceDirect, ACM Digital Library e IEEE Xplore. O período definido foi de 2016 a 2026 e foram usados termos em português e inglês ligados a Dijkstra, caminho mínimo, tráfego dependente do tempo, complexidade, memória e escalabilidade. A seleção priorizou estudos científicos sobre caminhos mínimos em redes viárias dinâmicas, com análise formal ou discussão explícita de desempenho e estrutura de dados. Foram excluídos trabalhos centrados em A* ou outras heurísticas, problemas de múltiplas entregas ou roteamento de veículos, estudos sem análise teórica pertinente e trabalhos sobre redes estáticas ou domínios diferentes. A busca reuniu aproximadamente 2.533 registros. Após a remoção de 130 duplicatas, a triagem de títulos e resumos registrou 2.325 exclusões, 65 casos de dúvida e 13 candidatos. A leitura de introdução e conclusão resultou em quatro estudos para análise comparativa.
+A comparação evidencia que o modelo temporal adotado influencia tanto a solução procurada quanto o esforço exigido. Constantinou et al. (2016) apresentam uma abordagem para velocidades viárias variáveis e expressões de complexidade para Dijkstra dependente do tempo: O(n² + mK), com vetor simples, e O(n log n + mK), com fila de prioridade de Fibonacci. Nessa notação, n é o número de vértices, m o número de arestas e K está ligado à discretização temporal. O termo associado a K mostra que representar a variação do trânsito pode acrescentar trabalho ao algoritmo. Baum et al. (2016), por sua vez, estudam planejamento dependente do tempo com preferências e consultas bidirecionais apoiadas por estruturas hierárquicas. Atalhos e perfis temporais podem reduzir o custo das consultas, mas ampliam a necessidade de armazenamento; aproximar esses perfis pode melhorar a eficiência, com possível perda de exatidão. Assim, reduzir o tempo de consulta não elimina os custos da representação usada para obter esse ganho.
+Heni, Coelho e Renaud (2019) analisam caminhos de custo mínimo com vários objetivos, mostrando que diferentes variantes acrescentam termos de complexidade ligados às técnicas e às variáveis de cada método. A comparação exige, portanto, verificar o significado dos símbolos e as hipóteses de cada expressão, em vez de ordenar os algoritmos apenas pela aparência da fórmula. Sun, Li e Liu (2023) consideram a espera em semáforos e a incerteza do tráfego, convertendo o problema estocástico em um modelo dependente do tempo resolvido com base em Dijkstra. O estudo amplia os fatores representados na rota, mas não fornece uma expressão de complexidade e uma medida de memória diretamente comparáveis às dos demais trabalhos. Também aponta limitações na representação dos tempos de sinalização e da dinâmica do tráfego em tempo real.
+Em conjunto, os estudos sugerem que a análise de caminho mínimo precisa considerar três dimensões relacionadas, mas distintas: o custo teórico de processamento, a memória requerida pelas estruturas temporais e a fidelidade com que o modelo representa a circulação real. Não é possível declarar uma variante universalmente superior, pois as hipóteses, os objetivos e as métricas não são iguais entre os trabalhos. A revisão também é limitada pelo conjunto final de quatro estudos e pela impossibilidade de estabelecer um ranking numérico comum. Como encaminhamento, pesquisas futuras podem definir condições de comparação compartilhadas e explicitar separadamente garantias teóricas, compromissos de aproximação e limitações dos dados. Essa distinção ajuda a interpretar o alcance dos resultados sem confundir eficiência algorítmica com adequação completa ao contexto urbano.</w:t>
       </w:r>
     </w:p>
     <w:p>

</xml_diff>